<commit_message>
README update new app
</commit_message>
<xml_diff>
--- a/template/ray/TEMPLATE.docx
+++ b/template/ray/TEMPLATE.docx
@@ -35,8 +35,8 @@
         <w:gridCol w:w="1037"/>
         <w:gridCol w:w="349"/>
         <w:gridCol w:w="256"/>
-        <w:gridCol w:w="225"/>
-        <w:gridCol w:w="613"/>
+        <w:gridCol w:w="658"/>
+        <w:gridCol w:w="180"/>
         <w:gridCol w:w="684"/>
         <w:gridCol w:w="45"/>
         <w:gridCol w:w="522"/>
@@ -231,7 +231,7 @@
         </w:tc>
         <w:tc>
           <w:tcPr>
-            <w:tcW w:w="830" w:type="dxa"/>
+            <w:tcW w:w="1263" w:type="dxa"/>
             <w:gridSpan w:val="3"/>
             <w:tcBorders>
               <w:top w:val="single" w:sz="8" w:space="0" w:color="auto"/>
@@ -258,7 +258,7 @@
         </w:tc>
         <w:tc>
           <w:tcPr>
-            <w:tcW w:w="5549" w:type="dxa"/>
+            <w:tcW w:w="5116" w:type="dxa"/>
             <w:gridSpan w:val="7"/>
             <w:tcBorders>
               <w:top w:val="single" w:sz="8" w:space="0" w:color="auto"/>
@@ -340,7 +340,7 @@
         </w:tc>
         <w:tc>
           <w:tcPr>
-            <w:tcW w:w="830" w:type="dxa"/>
+            <w:tcW w:w="1263" w:type="dxa"/>
             <w:gridSpan w:val="3"/>
             <w:tcBorders>
               <w:top w:val="single" w:sz="8" w:space="0" w:color="auto"/>
@@ -367,7 +367,7 @@
         </w:tc>
         <w:tc>
           <w:tcPr>
-            <w:tcW w:w="1297" w:type="dxa"/>
+            <w:tcW w:w="864" w:type="dxa"/>
             <w:gridSpan w:val="2"/>
             <w:tcBorders>
               <w:top w:val="single" w:sz="8" w:space="0" w:color="auto"/>
@@ -484,7 +484,7 @@
         </w:tc>
         <w:tc>
           <w:tcPr>
-            <w:tcW w:w="830" w:type="dxa"/>
+            <w:tcW w:w="1263" w:type="dxa"/>
             <w:gridSpan w:val="3"/>
             <w:vAlign w:val="center"/>
           </w:tcPr>
@@ -508,7 +508,7 @@
         </w:tc>
         <w:tc>
           <w:tcPr>
-            <w:tcW w:w="1297" w:type="dxa"/>
+            <w:tcW w:w="864" w:type="dxa"/>
             <w:gridSpan w:val="2"/>
             <w:vAlign w:val="center"/>
           </w:tcPr>
@@ -612,7 +612,7 @@
         </w:tc>
         <w:tc>
           <w:tcPr>
-            <w:tcW w:w="830" w:type="dxa"/>
+            <w:tcW w:w="1263" w:type="dxa"/>
             <w:gridSpan w:val="3"/>
             <w:noWrap/>
             <w:vAlign w:val="center"/>
@@ -637,7 +637,7 @@
         </w:tc>
         <w:tc>
           <w:tcPr>
-            <w:tcW w:w="1297" w:type="dxa"/>
+            <w:tcW w:w="864" w:type="dxa"/>
             <w:gridSpan w:val="2"/>
             <w:noWrap/>
             <w:vAlign w:val="center"/>
@@ -743,7 +743,7 @@
         </w:tc>
         <w:tc>
           <w:tcPr>
-            <w:tcW w:w="830" w:type="dxa"/>
+            <w:tcW w:w="1263" w:type="dxa"/>
             <w:gridSpan w:val="3"/>
             <w:noWrap/>
             <w:vAlign w:val="center"/>
@@ -768,7 +768,7 @@
         </w:tc>
         <w:tc>
           <w:tcPr>
-            <w:tcW w:w="1297" w:type="dxa"/>
+            <w:tcW w:w="864" w:type="dxa"/>
             <w:gridSpan w:val="2"/>
             <w:noWrap/>
             <w:vAlign w:val="center"/>
@@ -925,15 +925,20 @@
                 <w:szCs w:val="21"/>
               </w:rPr>
             </w:pPr>
-            <w:proofErr w:type="gramStart"/>
-            <w:r>
-              <w:rPr>
-                <w:rFonts w:ascii="宋体" w:hint="eastAsia"/>
-                <w:szCs w:val="21"/>
-              </w:rPr>
-              <w:t>焊口号</w:t>
-            </w:r>
-            <w:proofErr w:type="gramEnd"/>
+            <w:r>
+              <w:rPr>
+                <w:rFonts w:ascii="宋体" w:hint="eastAsia"/>
+                <w:szCs w:val="21"/>
+              </w:rPr>
+              <w:t>焊</w:t>
+            </w:r>
+            <w:r>
+              <w:rPr>
+                <w:rFonts w:ascii="宋体" w:hint="eastAsia"/>
+                <w:szCs w:val="21"/>
+              </w:rPr>
+              <w:t>口号</w:t>
+            </w:r>
           </w:p>
         </w:tc>
         <w:tc>

</xml_diff>